<commit_message>
Update project documentation and tracking files for PROJ-001 and PROJ-002
</commit_message>
<xml_diff>
--- a/projects/PROJ-001-Croon-Wolter-Simonshaven-EMC/reports/Site Audit/Site Audit proposal for report V1.docx
+++ b/projects/PROJ-001-Croon-Wolter-Simonshaven-EMC/reports/Site Audit/Site Audit proposal for report V1.docx
@@ -4,6 +4,24 @@
   <w:body>
     <w:p>
       <w:pPr>
+        <w:spacing w:line="360" w:lineRule="auto"/>
+        <w:rPr>
+          <w:color w:val="FF0000"/>
+          <w:sz w:val="44"/>
+          <w:szCs w:val="44"/>
+        </w:rPr>
+      </w:pPr>
+      <w:r>
+        <w:rPr>
+          <w:color w:val="FF0000"/>
+          <w:sz w:val="44"/>
+          <w:szCs w:val="44"/>
+        </w:rPr>
+        <w:t>DRAFT working version – comments welcome</w:t>
+      </w:r>
+    </w:p>
+    <w:p>
+      <w:pPr>
         <w:pStyle w:val="Heading1"/>
         <w:spacing w:line="360" w:lineRule="auto"/>
         <w:rPr>
@@ -36,7 +54,35 @@
         <w:rPr>
           <w:lang w:val="en-US"/>
         </w:rPr>
-        <w:t xml:space="preserve"> Simonshaven 380kV Uitbreiding (DP2-4)</w:t>
+        <w:t xml:space="preserve"> </w:t>
+      </w:r>
+      <w:proofErr w:type="spellStart"/>
+      <w:r>
+        <w:rPr>
+          <w:lang w:val="en-US"/>
+        </w:rPr>
+        <w:t>Simonshaven</w:t>
+      </w:r>
+      <w:proofErr w:type="spellEnd"/>
+      <w:r>
+        <w:rPr>
+          <w:lang w:val="en-US"/>
+        </w:rPr>
+        <w:t xml:space="preserve"> 380kV </w:t>
+      </w:r>
+      <w:proofErr w:type="spellStart"/>
+      <w:r>
+        <w:rPr>
+          <w:lang w:val="en-US"/>
+        </w:rPr>
+        <w:t>Uitbreiding</w:t>
+      </w:r>
+      <w:proofErr w:type="spellEnd"/>
+      <w:r>
+        <w:rPr>
+          <w:lang w:val="en-US"/>
+        </w:rPr>
+        <w:t xml:space="preserve"> (DP2-4)</w:t>
       </w:r>
       <w:r>
         <w:rPr>
@@ -96,7 +142,19 @@
         <w:rPr>
           <w:lang w:val="en-US"/>
         </w:rPr>
-        <w:t xml:space="preserve"> [Insert Date]</w:t>
+        <w:t xml:space="preserve"> </w:t>
+      </w:r>
+      <w:r>
+        <w:rPr>
+          <w:lang w:val="en-US"/>
+        </w:rPr>
+        <w:t>xx</w:t>
+      </w:r>
+      <w:r>
+        <w:rPr>
+          <w:lang w:val="en-US"/>
+        </w:rPr>
+        <w:t>-12-2025</w:t>
       </w:r>
       <w:r>
         <w:rPr>
@@ -116,7 +174,14 @@
         <w:rPr>
           <w:lang w:val="en-US"/>
         </w:rPr>
-        <w:t xml:space="preserve"> DRAFT (Pending Site Visit &amp; DP2-4 DO Documentation)</w:t>
+        <w:t xml:space="preserve"> </w:t>
+      </w:r>
+      <w:r>
+        <w:rPr>
+          <w:color w:val="FF0000"/>
+          <w:lang w:val="en-US"/>
+        </w:rPr>
+        <w:t>DRAFT (Pending Site Visit &amp; DP2-4 DO Documentation)</w:t>
       </w:r>
     </w:p>
     <w:p>
@@ -157,6 +222,7 @@
         </w:rPr>
         <w:t>This report documents the findings of the EMC Baseline Survey (</w:t>
       </w:r>
+      <w:proofErr w:type="spellStart"/>
       <w:r>
         <w:rPr>
           <w:i/>
@@ -165,11 +231,26 @@
         </w:rPr>
         <w:t>Nulinspectie</w:t>
       </w:r>
+      <w:proofErr w:type="spellEnd"/>
       <w:r>
         <w:rPr>
           <w:lang w:val="en-US"/>
         </w:rPr>
-        <w:t>) performed by DNV at the Simonshaven 380kV substation.</w:t>
+        <w:t xml:space="preserve">) performed by DNV at the </w:t>
+      </w:r>
+      <w:proofErr w:type="spellStart"/>
+      <w:r>
+        <w:rPr>
+          <w:lang w:val="en-US"/>
+        </w:rPr>
+        <w:t>Simonshaven</w:t>
+      </w:r>
+      <w:proofErr w:type="spellEnd"/>
+      <w:r>
+        <w:rPr>
+          <w:lang w:val="en-US"/>
+        </w:rPr>
+        <w:t xml:space="preserve"> 380kV substation.</w:t>
       </w:r>
     </w:p>
     <w:p>
@@ -214,7 +295,21 @@
           <w:lang w:val="en-US"/>
         </w:rPr>
         <w:br/>
-        <w:t xml:space="preserve">Based on the review of the DP1 As-Built documentation [2], it is a known fact that the existing buildings (CDG and Takhuisjes) </w:t>
+        <w:t xml:space="preserve">Based on the review of the DP1 As-Built documentation [2], it is a known fact that the existing buildings (CDG and </w:t>
+      </w:r>
+      <w:proofErr w:type="spellStart"/>
+      <w:r>
+        <w:rPr>
+          <w:lang w:val="en-US"/>
+        </w:rPr>
+        <w:t>Takhuisjes</w:t>
+      </w:r>
+      <w:proofErr w:type="spellEnd"/>
+      <w:r>
+        <w:rPr>
+          <w:lang w:val="en-US"/>
+        </w:rPr>
+        <w:t xml:space="preserve">) </w:t>
       </w:r>
       <w:r>
         <w:rPr>
@@ -263,25 +358,59 @@
         <w:rPr>
           <w:lang w:val="en-US"/>
         </w:rPr>
-        <w:t xml:space="preserve"> If the existing buildings are confirmed to be unshielded (LPZ 1), the design for DP2-4 </w:t>
+        <w:t xml:space="preserve"> If the existing buildings are confirmed to be unshielded (LPZ 1), the design for DP2-</w:t>
       </w:r>
       <w:r>
         <w:rPr>
-          <w:b/>
-          <w:bCs/>
           <w:lang w:val="en-US"/>
         </w:rPr>
-        <w:t>must</w:t>
+        <w:t xml:space="preserve">4 </w:t>
       </w:r>
       <w:r>
         <w:rPr>
           <w:lang w:val="en-US"/>
         </w:rPr>
-        <w:t xml:space="preserve"> compensate for this by applying higher immunity specifications or cabinet-level shielding for all new secondary equipment installed in these rooms.</w:t>
+        <w:t>might be subject to</w:t>
+      </w:r>
+      <w:r>
+        <w:rPr>
+          <w:lang w:val="en-US"/>
+        </w:rPr>
+        <w:t xml:space="preserve"> higher immunity</w:t>
+      </w:r>
+      <w:r>
+        <w:rPr>
+          <w:lang w:val="en-US"/>
+        </w:rPr>
+        <w:t xml:space="preserve"> specifications or cabinet-level shielding for all new secondary equipment installed in these rooms.</w:t>
+      </w:r>
+      <w:r>
+        <w:rPr>
+          <w:lang w:val="en-US"/>
+        </w:rPr>
+        <w:t xml:space="preserve"> This will be evaluated during the EMC management design.</w:t>
       </w:r>
     </w:p>
     <w:p>
       <w:pPr>
+        <w:spacing w:after="200" w:line="276" w:lineRule="auto"/>
+        <w:rPr>
+          <w:b/>
+          <w:caps/>
+          <w:color w:val="0F204B"/>
+          <w:sz w:val="26"/>
+          <w:lang w:val="nl-NL"/>
+        </w:rPr>
+      </w:pPr>
+      <w:r>
+        <w:rPr>
+          <w:lang w:val="nl-NL"/>
+        </w:rPr>
+        <w:br w:type="page"/>
+      </w:r>
+    </w:p>
+    <w:p>
+      <w:pPr>
         <w:pStyle w:val="Heading1"/>
         <w:spacing w:line="360" w:lineRule="auto"/>
         <w:rPr>
@@ -292,6 +421,7 @@
         <w:rPr>
           <w:lang w:val="nl-NL"/>
         </w:rPr>
+        <w:lastRenderedPageBreak/>
         <w:t>Introduction</w:t>
       </w:r>
     </w:p>
@@ -321,7 +451,21 @@
         <w:rPr>
           <w:lang w:val="en-US"/>
         </w:rPr>
-        <w:t>SC&amp;M is executing the expansion of the Simonshaven substation (DP2-4). This involves integrating new high-voltage assets (Transformers TR412-414, Compensation Coils, Bays 4-5) into the existing operational environment (DP1).</w:t>
+        <w:t xml:space="preserve">SC&amp;M is executing the expansion of the </w:t>
+      </w:r>
+      <w:proofErr w:type="spellStart"/>
+      <w:r>
+        <w:rPr>
+          <w:lang w:val="en-US"/>
+        </w:rPr>
+        <w:t>Simonshaven</w:t>
+      </w:r>
+      <w:proofErr w:type="spellEnd"/>
+      <w:r>
+        <w:rPr>
+          <w:lang w:val="en-US"/>
+        </w:rPr>
+        <w:t xml:space="preserve"> substation (DP2-4). This involves integrating new high-voltage assets (Transformers TR412-414, Compensation Coils, Bays 4-5) into the existing operational environment (DP1).</w:t>
       </w:r>
     </w:p>
     <w:p>
@@ -352,6 +496,7 @@
         </w:rPr>
         <w:t xml:space="preserve">The scope of this </w:t>
       </w:r>
+      <w:proofErr w:type="spellStart"/>
       <w:r>
         <w:rPr>
           <w:i/>
@@ -360,6 +505,7 @@
         </w:rPr>
         <w:t>Nulinspectie</w:t>
       </w:r>
+      <w:proofErr w:type="spellEnd"/>
       <w:r>
         <w:rPr>
           <w:lang w:val="en-US"/>
@@ -390,7 +536,21 @@
         <w:rPr>
           <w:lang w:val="en-US"/>
         </w:rPr>
-        <w:t xml:space="preserve"> Verification of visible earthing, bonding, shielding, and cable routing in the existing CDG, Takhuisjes, and accessible cable trenches.</w:t>
+        <w:t xml:space="preserve"> Verification of visible earthing, bonding, shielding, and cable routing in the existing CDG, </w:t>
+      </w:r>
+      <w:proofErr w:type="spellStart"/>
+      <w:r>
+        <w:rPr>
+          <w:lang w:val="en-US"/>
+        </w:rPr>
+        <w:t>Takhuisjes</w:t>
+      </w:r>
+      <w:proofErr w:type="spellEnd"/>
+      <w:r>
+        <w:rPr>
+          <w:lang w:val="en-US"/>
+        </w:rPr>
+        <w:t>, and accessible cable trenches.</w:t>
       </w:r>
     </w:p>
     <w:p>
@@ -501,13 +661,41 @@
         </w:rPr>
         <w:t xml:space="preserve"> At the time of this inspection, the </w:t>
       </w:r>
+      <w:proofErr w:type="spellStart"/>
       <w:r>
         <w:rPr>
           <w:b/>
           <w:bCs/>
           <w:lang w:val="en-US"/>
         </w:rPr>
-        <w:t>Definitief Ontwerp (DO)</w:t>
+        <w:t>Definitief</w:t>
+      </w:r>
+      <w:proofErr w:type="spellEnd"/>
+      <w:r>
+        <w:rPr>
+          <w:b/>
+          <w:bCs/>
+          <w:lang w:val="en-US"/>
+        </w:rPr>
+        <w:t xml:space="preserve"> </w:t>
+      </w:r>
+      <w:proofErr w:type="spellStart"/>
+      <w:r>
+        <w:rPr>
+          <w:b/>
+          <w:bCs/>
+          <w:lang w:val="en-US"/>
+        </w:rPr>
+        <w:t>Ontwerp</w:t>
+      </w:r>
+      <w:proofErr w:type="spellEnd"/>
+      <w:r>
+        <w:rPr>
+          <w:b/>
+          <w:bCs/>
+          <w:lang w:val="en-US"/>
+        </w:rPr>
+        <w:t xml:space="preserve"> (DO)</w:t>
       </w:r>
       <w:r>
         <w:rPr>
@@ -554,7 +742,6 @@
         <w:rPr>
           <w:lang w:val="nl-NL"/>
         </w:rPr>
-        <w:lastRenderedPageBreak/>
         <w:t>Reference Framework</w:t>
       </w:r>
     </w:p>
@@ -788,11 +975,19 @@
                 <w:lang w:val="en-US"/>
               </w:rPr>
             </w:pPr>
+            <w:proofErr w:type="spellStart"/>
             <w:r>
               <w:rPr>
                 <w:lang w:val="en-US"/>
               </w:rPr>
-              <w:t>TenneT's mandatory rules for zoning (LPZ) and installation details.</w:t>
+              <w:t>TenneT's</w:t>
+            </w:r>
+            <w:proofErr w:type="spellEnd"/>
+            <w:r>
+              <w:rPr>
+                <w:lang w:val="en-US"/>
+              </w:rPr>
+              <w:t xml:space="preserve"> mandatory rules for zoning (LPZ) and installation details.</w:t>
             </w:r>
           </w:p>
         </w:tc>
@@ -1052,7 +1247,25 @@
           <w:iCs/>
           <w:lang w:val="en-US"/>
         </w:rPr>
-        <w:t>EMC beheersplan SMH380</w:t>
+        <w:t xml:space="preserve">EMC </w:t>
+      </w:r>
+      <w:proofErr w:type="spellStart"/>
+      <w:r>
+        <w:rPr>
+          <w:i/>
+          <w:iCs/>
+          <w:lang w:val="en-US"/>
+        </w:rPr>
+        <w:t>beheersplan</w:t>
+      </w:r>
+      <w:proofErr w:type="spellEnd"/>
+      <w:r>
+        <w:rPr>
+          <w:i/>
+          <w:iCs/>
+          <w:lang w:val="en-US"/>
+        </w:rPr>
+        <w:t xml:space="preserve"> SMH380</w:t>
       </w:r>
       <w:r>
         <w:rPr>
@@ -1084,7 +1297,21 @@
         <w:rPr>
           <w:lang w:val="en-US"/>
         </w:rPr>
-        <w:t xml:space="preserve"> Document [2] states that the EMC mesh (30x30mm) in the CDG and Takhuisjes was "not correctly installed."</w:t>
+        <w:t xml:space="preserve"> Document [2] states that the EMC mesh (30x30mm) in the CDG and </w:t>
+      </w:r>
+      <w:proofErr w:type="spellStart"/>
+      <w:r>
+        <w:rPr>
+          <w:lang w:val="en-US"/>
+        </w:rPr>
+        <w:t>Takhuisjes</w:t>
+      </w:r>
+      <w:proofErr w:type="spellEnd"/>
+      <w:r>
+        <w:rPr>
+          <w:lang w:val="en-US"/>
+        </w:rPr>
+        <w:t xml:space="preserve"> was "not correctly installed."</w:t>
       </w:r>
     </w:p>
     <w:p>
@@ -1184,13 +1411,28 @@
           <w:bCs/>
           <w:lang w:val="en-US"/>
         </w:rPr>
+        <w:lastRenderedPageBreak/>
         <w:t>Cable Entry Integrity:</w:t>
       </w:r>
       <w:r>
         <w:rPr>
           <w:lang w:val="en-US"/>
         </w:rPr>
-        <w:t xml:space="preserve"> There is ambiguity regarding the bonding of Roxtec frames and the termination of cable shields at the building entry.</w:t>
+        <w:t xml:space="preserve"> There is ambiguity regarding the bonding of </w:t>
+      </w:r>
+      <w:proofErr w:type="spellStart"/>
+      <w:r>
+        <w:rPr>
+          <w:lang w:val="en-US"/>
+        </w:rPr>
+        <w:t>Roxtec</w:t>
+      </w:r>
+      <w:proofErr w:type="spellEnd"/>
+      <w:r>
+        <w:rPr>
+          <w:lang w:val="en-US"/>
+        </w:rPr>
+        <w:t xml:space="preserve"> frames and the termination of cable shields at the building entry.</w:t>
       </w:r>
     </w:p>
     <w:p>
@@ -1325,6 +1567,24 @@
     </w:p>
     <w:p>
       <w:pPr>
+        <w:spacing w:after="200" w:line="276" w:lineRule="auto"/>
+        <w:rPr>
+          <w:b/>
+          <w:caps/>
+          <w:color w:val="0F204B"/>
+          <w:sz w:val="26"/>
+          <w:lang w:val="nl-NL"/>
+        </w:rPr>
+      </w:pPr>
+      <w:r>
+        <w:rPr>
+          <w:lang w:val="nl-NL"/>
+        </w:rPr>
+        <w:br w:type="page"/>
+      </w:r>
+    </w:p>
+    <w:p>
+      <w:pPr>
         <w:pStyle w:val="Heading1"/>
         <w:spacing w:line="360" w:lineRule="auto"/>
         <w:rPr>
@@ -1335,6 +1595,7 @@
         <w:rPr>
           <w:lang w:val="nl-NL"/>
         </w:rPr>
+        <w:lastRenderedPageBreak/>
         <w:t>Inspection Findings</w:t>
       </w:r>
     </w:p>
@@ -1365,7 +1626,7 @@
           <w:b/>
           <w:bCs/>
           <w:color w:val="FF0000"/>
-          <w:lang w:val="nl-NL"/>
+          <w:lang w:val="en-US"/>
         </w:rPr>
       </w:pPr>
     </w:p>
@@ -1382,7 +1643,23 @@
           <w:color w:val="FF0000"/>
           <w:lang w:val="en-US"/>
         </w:rPr>
-        <w:t xml:space="preserve">This section details the observations made during the visual inspection of the Simonshaven 380kV substation (DP1 area). The inspection focused on verifying the "As-Built" status against the TenneT </w:t>
+        <w:t xml:space="preserve">This section details the observations made during the visual inspection of the </w:t>
+      </w:r>
+      <w:proofErr w:type="spellStart"/>
+      <w:r>
+        <w:rPr>
+          <w:color w:val="FF0000"/>
+          <w:lang w:val="en-US"/>
+        </w:rPr>
+        <w:t>Simonshaven</w:t>
+      </w:r>
+      <w:proofErr w:type="spellEnd"/>
+      <w:r>
+        <w:rPr>
+          <w:color w:val="FF0000"/>
+          <w:lang w:val="en-US"/>
+        </w:rPr>
+        <w:t xml:space="preserve"> 380kV substation (DP1 area). The inspection focused on verifying the "As-Built" status against the TenneT </w:t>
       </w:r>
       <w:r>
         <w:rPr>
@@ -1391,7 +1668,27 @@
           <w:color w:val="FF0000"/>
           <w:lang w:val="en-US"/>
         </w:rPr>
-        <w:t>EMC eisen-zone concept</w:t>
+        <w:t xml:space="preserve">EMC </w:t>
+      </w:r>
+      <w:proofErr w:type="spellStart"/>
+      <w:r>
+        <w:rPr>
+          <w:i/>
+          <w:iCs/>
+          <w:color w:val="FF0000"/>
+          <w:lang w:val="en-US"/>
+        </w:rPr>
+        <w:t>eisen</w:t>
+      </w:r>
+      <w:proofErr w:type="spellEnd"/>
+      <w:r>
+        <w:rPr>
+          <w:i/>
+          <w:iCs/>
+          <w:color w:val="FF0000"/>
+          <w:lang w:val="en-US"/>
+        </w:rPr>
+        <w:t>-zone concept</w:t>
       </w:r>
       <w:r>
         <w:rPr>
@@ -1455,7 +1752,23 @@
           <w:color w:val="FF0000"/>
           <w:lang w:val="en-US"/>
         </w:rPr>
-        <w:t xml:space="preserve"> Visual check of the Roxtec cable transit frames in the AC/DC and Telecom rooms. Verification of frame bonding to the main earth bar and correct termination of cable shields (360° bonding) within the modules, in accordance with </w:t>
+        <w:t xml:space="preserve"> Visual check of the </w:t>
+      </w:r>
+      <w:proofErr w:type="spellStart"/>
+      <w:r>
+        <w:rPr>
+          <w:color w:val="FF0000"/>
+          <w:lang w:val="en-US"/>
+        </w:rPr>
+        <w:t>Roxtec</w:t>
+      </w:r>
+      <w:proofErr w:type="spellEnd"/>
+      <w:r>
+        <w:rPr>
+          <w:color w:val="FF0000"/>
+          <w:lang w:val="en-US"/>
+        </w:rPr>
+        <w:t xml:space="preserve"> cable transit frames in the AC/DC and Telecom rooms. Verification of frame bonding to the main earth bar and correct termination of cable shields (360° bonding) within the modules, in accordance with </w:t>
       </w:r>
       <w:r>
         <w:rPr>
@@ -1513,7 +1826,23 @@
           <w:color w:val="FF0000"/>
           <w:lang w:val="en-US"/>
         </w:rPr>
-        <w:t xml:space="preserve">The physical condition of the Roxtec frames was found to be </w:t>
+        <w:t xml:space="preserve">The physical condition of the </w:t>
+      </w:r>
+      <w:proofErr w:type="spellStart"/>
+      <w:r>
+        <w:rPr>
+          <w:color w:val="FF0000"/>
+          <w:lang w:val="en-US"/>
+        </w:rPr>
+        <w:t>Roxtec</w:t>
+      </w:r>
+      <w:proofErr w:type="spellEnd"/>
+      <w:r>
+        <w:rPr>
+          <w:color w:val="FF0000"/>
+          <w:lang w:val="en-US"/>
+        </w:rPr>
+        <w:t xml:space="preserve"> frames was found to be </w:t>
       </w:r>
       <w:r>
         <w:rPr>
@@ -1549,7 +1878,23 @@
           <w:color w:val="FF0000"/>
           <w:lang w:val="en-US"/>
         </w:rPr>
-        <w:t xml:space="preserve">The bonding connection between the transit frame and the room’s ring earth (aardrail) was </w:t>
+        <w:t>The bonding connection between the transit frame and the room’s ring earth (</w:t>
+      </w:r>
+      <w:proofErr w:type="spellStart"/>
+      <w:r>
+        <w:rPr>
+          <w:color w:val="FF0000"/>
+          <w:lang w:val="en-US"/>
+        </w:rPr>
+        <w:t>aardrail</w:t>
+      </w:r>
+      <w:proofErr w:type="spellEnd"/>
+      <w:r>
+        <w:rPr>
+          <w:color w:val="FF0000"/>
+          <w:lang w:val="en-US"/>
+        </w:rPr>
+        <w:t xml:space="preserve">) was </w:t>
       </w:r>
       <w:r>
         <w:rPr>
@@ -1585,7 +1930,6 @@
           <w:color w:val="FF0000"/>
           <w:lang w:val="en-US"/>
         </w:rPr>
-        <w:lastRenderedPageBreak/>
         <w:t xml:space="preserve">Regarding cable shields: </w:t>
       </w:r>
       <w:r>
@@ -1674,7 +2018,23 @@
           <w:color w:val="FF0000"/>
           <w:lang w:val="en-US"/>
         </w:rPr>
-        <w:t xml:space="preserve"> Verification of the Faraday cage concept (LPZ 2). Inspection of bonding points between the wall reinforcement (wapening/EMC-net) and the earthing system, and bonding of metal door frames.</w:t>
+        <w:t xml:space="preserve"> Verification of the Faraday cage concept (LPZ 2). Inspection of bonding points between the wall reinforcement (</w:t>
+      </w:r>
+      <w:proofErr w:type="spellStart"/>
+      <w:r>
+        <w:rPr>
+          <w:color w:val="FF0000"/>
+          <w:lang w:val="en-US"/>
+        </w:rPr>
+        <w:t>wapening</w:t>
+      </w:r>
+      <w:proofErr w:type="spellEnd"/>
+      <w:r>
+        <w:rPr>
+          <w:color w:val="FF0000"/>
+          <w:lang w:val="en-US"/>
+        </w:rPr>
+        <w:t>/EMC-net) and the earthing system, and bonding of metal door frames.</w:t>
       </w:r>
     </w:p>
     <w:p>
@@ -1768,7 +2128,23 @@
           <w:color w:val="FF0000"/>
           <w:lang w:val="en-US"/>
         </w:rPr>
-        <w:t xml:space="preserve"> bonded to the structure earth with short flexible straps (litze).</w:t>
+        <w:t xml:space="preserve"> bonded to the structure earth with short flexible straps (</w:t>
+      </w:r>
+      <w:proofErr w:type="spellStart"/>
+      <w:r>
+        <w:rPr>
+          <w:color w:val="FF0000"/>
+          <w:lang w:val="en-US"/>
+        </w:rPr>
+        <w:t>litze</w:t>
+      </w:r>
+      <w:proofErr w:type="spellEnd"/>
+      <w:r>
+        <w:rPr>
+          <w:color w:val="FF0000"/>
+          <w:lang w:val="en-US"/>
+        </w:rPr>
+        <w:t>).</w:t>
       </w:r>
     </w:p>
     <w:p>
@@ -1790,7 +2166,27 @@
           <w:color w:val="FF0000"/>
           <w:lang w:val="en-US"/>
         </w:rPr>
-        <w:t>[Optional: Note any penetrations through the walls that are not treated, e.g., drilled holes for new cables without glands.]</w:t>
+        <w:t xml:space="preserve">[Optional: Note any </w:t>
+      </w:r>
+      <w:proofErr w:type="gramStart"/>
+      <w:r>
+        <w:rPr>
+          <w:b/>
+          <w:bCs/>
+          <w:color w:val="FF0000"/>
+          <w:lang w:val="en-US"/>
+        </w:rPr>
+        <w:t>penetrations</w:t>
+      </w:r>
+      <w:proofErr w:type="gramEnd"/>
+      <w:r>
+        <w:rPr>
+          <w:b/>
+          <w:bCs/>
+          <w:color w:val="FF0000"/>
+          <w:lang w:val="en-US"/>
+        </w:rPr>
+        <w:t xml:space="preserve"> through the walls that are not treated, e.g., drilled holes for new cables without glands.]</w:t>
       </w:r>
     </w:p>
     <w:p>
@@ -1862,7 +2258,23 @@
           <w:color w:val="FF0000"/>
           <w:lang w:val="en-US"/>
         </w:rPr>
-        <w:t xml:space="preserve"> Check of cabinet earthing and cable gland plates (wartelplaten) in the CDG server/telecom room.</w:t>
+        <w:t xml:space="preserve"> Check of cabinet earthing and cable gland plates (</w:t>
+      </w:r>
+      <w:proofErr w:type="spellStart"/>
+      <w:r>
+        <w:rPr>
+          <w:color w:val="FF0000"/>
+          <w:lang w:val="en-US"/>
+        </w:rPr>
+        <w:t>wartelplaten</w:t>
+      </w:r>
+      <w:proofErr w:type="spellEnd"/>
+      <w:r>
+        <w:rPr>
+          <w:color w:val="FF0000"/>
+          <w:lang w:val="en-US"/>
+        </w:rPr>
+        <w:t>) in the CDG server/telecom room.</w:t>
       </w:r>
     </w:p>
     <w:p>
@@ -1913,7 +2325,27 @@
           <w:color w:val="FF0000"/>
           <w:lang w:val="en-US"/>
         </w:rPr>
-        <w:t>[Short flat copper litz wire / Long round yellow-green wire (Pigtail)]</w:t>
+        <w:t xml:space="preserve">[Short flat copper </w:t>
+      </w:r>
+      <w:proofErr w:type="spellStart"/>
+      <w:r>
+        <w:rPr>
+          <w:b/>
+          <w:bCs/>
+          <w:color w:val="FF0000"/>
+          <w:lang w:val="en-US"/>
+        </w:rPr>
+        <w:t>litz</w:t>
+      </w:r>
+      <w:proofErr w:type="spellEnd"/>
+      <w:r>
+        <w:rPr>
+          <w:b/>
+          <w:bCs/>
+          <w:color w:val="FF0000"/>
+          <w:lang w:val="en-US"/>
+        </w:rPr>
+        <w:t xml:space="preserve"> wire / Long round yellow-green wire (Pigtail)]</w:t>
       </w:r>
       <w:r>
         <w:rPr>
@@ -1999,6 +2431,7 @@
         <w:rPr>
           <w:lang w:val="nl-NL"/>
         </w:rPr>
+        <w:lastRenderedPageBreak/>
         <w:t>Bay Houses (Takhuisjes)</w:t>
       </w:r>
     </w:p>
@@ -2120,7 +2553,23 @@
           <w:color w:val="FF0000"/>
           <w:lang w:val="en-US"/>
         </w:rPr>
-        <w:t xml:space="preserve">Earth bars (aardrails) on the walls </w:t>
+        <w:t>Earth bars (</w:t>
+      </w:r>
+      <w:proofErr w:type="spellStart"/>
+      <w:r>
+        <w:rPr>
+          <w:color w:val="FF0000"/>
+          <w:lang w:val="en-US"/>
+        </w:rPr>
+        <w:t>aardrails</w:t>
+      </w:r>
+      <w:proofErr w:type="spellEnd"/>
+      <w:r>
+        <w:rPr>
+          <w:color w:val="FF0000"/>
+          <w:lang w:val="en-US"/>
+        </w:rPr>
+        <w:t xml:space="preserve">) on the walls </w:t>
       </w:r>
       <w:r>
         <w:rPr>
@@ -2331,7 +2780,6 @@
         <w:rPr>
           <w:lang w:val="nl-NL"/>
         </w:rPr>
-        <w:lastRenderedPageBreak/>
         <w:t>Field Infrastructure (Buitenterrein)</w:t>
       </w:r>
     </w:p>
@@ -2828,6 +3276,7 @@
           <w:color w:val="FF0000"/>
           <w:lang w:val="en-US"/>
         </w:rPr>
+        <w:lastRenderedPageBreak/>
         <w:t xml:space="preserve">Flexible earthing straps between fence panels are </w:t>
       </w:r>
       <w:r>
@@ -2997,7 +3446,23 @@
           <w:color w:val="FF0000"/>
           <w:lang w:val="en-US"/>
         </w:rPr>
-        <w:t xml:space="preserve"> There is evidence of recent cabling modifications where EMC glands were </w:t>
+        <w:t xml:space="preserve"> There is evidence of recent </w:t>
+      </w:r>
+      <w:proofErr w:type="gramStart"/>
+      <w:r>
+        <w:rPr>
+          <w:color w:val="FF0000"/>
+          <w:lang w:val="en-US"/>
+        </w:rPr>
+        <w:t>cabling</w:t>
+      </w:r>
+      <w:proofErr w:type="gramEnd"/>
+      <w:r>
+        <w:rPr>
+          <w:color w:val="FF0000"/>
+          <w:lang w:val="en-US"/>
+        </w:rPr>
+        <w:t xml:space="preserve"> modifications where EMC glands were </w:t>
       </w:r>
       <w:r>
         <w:rPr>
@@ -3038,7 +3503,39 @@
           <w:color w:val="FF0000"/>
           <w:lang w:val="en-US"/>
         </w:rPr>
-        <w:t>Consider integrating the below tables in the headings above.</w:t>
+        <w:t xml:space="preserve">Consider integrating the </w:t>
+      </w:r>
+      <w:proofErr w:type="gramStart"/>
+      <w:r>
+        <w:rPr>
+          <w:color w:val="FF0000"/>
+          <w:lang w:val="en-US"/>
+        </w:rPr>
+        <w:t>below tables</w:t>
+      </w:r>
+      <w:proofErr w:type="gramEnd"/>
+      <w:r>
+        <w:rPr>
+          <w:color w:val="FF0000"/>
+          <w:lang w:val="en-US"/>
+        </w:rPr>
+        <w:t xml:space="preserve"> </w:t>
+      </w:r>
+      <w:proofErr w:type="gramStart"/>
+      <w:r>
+        <w:rPr>
+          <w:color w:val="FF0000"/>
+          <w:lang w:val="en-US"/>
+        </w:rPr>
+        <w:t>in</w:t>
+      </w:r>
+      <w:proofErr w:type="gramEnd"/>
+      <w:r>
+        <w:rPr>
+          <w:color w:val="FF0000"/>
+          <w:lang w:val="en-US"/>
+        </w:rPr>
+        <w:t xml:space="preserve"> the headings above.</w:t>
       </w:r>
     </w:p>
     <w:p>
@@ -3049,11 +3546,27 @@
           <w:lang w:val="nl-NL"/>
         </w:rPr>
       </w:pPr>
+      <w:commentRangeStart w:id="0"/>
       <w:r>
         <w:rPr>
           <w:lang w:val="nl-NL"/>
         </w:rPr>
         <w:t>Central Service Building (CDG)</w:t>
+      </w:r>
+      <w:commentRangeEnd w:id="0"/>
+      <w:r>
+        <w:rPr>
+          <w:rStyle w:val="CommentReference"/>
+          <w:b w:val="0"/>
+          <w:color w:val="auto"/>
+        </w:rPr>
+        <w:commentReference w:id="0"/>
+      </w:r>
+      <w:r>
+        <w:rPr>
+          <w:lang w:val="nl-NL"/>
+        </w:rPr>
+        <w:t xml:space="preserve"> – 9:15 – 9:45</w:t>
       </w:r>
     </w:p>
     <w:tbl>
@@ -3063,10 +3576,10 @@
         <w:tblLook w:val="04A0" w:firstRow="1" w:lastRow="0" w:firstColumn="1" w:lastColumn="0" w:noHBand="0" w:noVBand="1"/>
       </w:tblPr>
       <w:tblGrid>
-        <w:gridCol w:w="618"/>
-        <w:gridCol w:w="2523"/>
-        <w:gridCol w:w="4849"/>
-        <w:gridCol w:w="855"/>
+        <w:gridCol w:w="617"/>
+        <w:gridCol w:w="1788"/>
+        <w:gridCol w:w="5555"/>
+        <w:gridCol w:w="885"/>
         <w:gridCol w:w="727"/>
       </w:tblGrid>
       <w:tr>
@@ -3092,7 +3605,7 @@
         </w:tc>
         <w:tc>
           <w:tcPr>
-            <w:tcW w:w="0" w:type="auto"/>
+            <w:tcW w:w="1788" w:type="dxa"/>
             <w:hideMark/>
           </w:tcPr>
           <w:p>
@@ -3112,7 +3625,7 @@
         </w:tc>
         <w:tc>
           <w:tcPr>
-            <w:tcW w:w="0" w:type="auto"/>
+            <w:tcW w:w="5555" w:type="dxa"/>
             <w:hideMark/>
           </w:tcPr>
           <w:p>
@@ -3204,13 +3717,15 @@
         </w:tc>
         <w:tc>
           <w:tcPr>
-            <w:tcW w:w="0" w:type="auto"/>
+            <w:tcW w:w="1788" w:type="dxa"/>
             <w:hideMark/>
           </w:tcPr>
           <w:p>
             <w:pPr>
               <w:spacing w:line="360" w:lineRule="auto"/>
               <w:rPr>
+                <w:b/>
+                <w:bCs/>
                 <w:lang w:val="en-US"/>
               </w:rPr>
             </w:pPr>
@@ -3222,6 +3737,14 @@
               </w:rPr>
               <w:t>Cable Entry (AC/DC Room)</w:t>
             </w:r>
+          </w:p>
+          <w:p>
+            <w:pPr>
+              <w:spacing w:line="360" w:lineRule="auto"/>
+              <w:rPr>
+                <w:lang w:val="en-US"/>
+              </w:rPr>
+            </w:pPr>
             <w:r>
               <w:rPr>
                 <w:lang w:val="en-US"/>
@@ -3232,7 +3755,7 @@
         </w:tc>
         <w:tc>
           <w:tcPr>
-            <w:tcW w:w="0" w:type="auto"/>
+            <w:tcW w:w="5555" w:type="dxa"/>
             <w:hideMark/>
           </w:tcPr>
           <w:p>
@@ -3246,7 +3769,21 @@
               <w:rPr>
                 <w:lang w:val="en-US"/>
               </w:rPr>
-              <w:t>[PLACEHOLDER: Describe state of Roxtec frames. Are they earthed to the ring earth?]</w:t>
+              <w:t xml:space="preserve">[PLACEHOLDER: Describe state of </w:t>
+            </w:r>
+            <w:proofErr w:type="spellStart"/>
+            <w:r>
+              <w:rPr>
+                <w:lang w:val="en-US"/>
+              </w:rPr>
+              <w:t>Roxtec</w:t>
+            </w:r>
+            <w:proofErr w:type="spellEnd"/>
+            <w:r>
+              <w:rPr>
+                <w:lang w:val="en-US"/>
+              </w:rPr>
+              <w:t xml:space="preserve"> frames. Are they earthed to the ring earth?]</w:t>
             </w:r>
           </w:p>
         </w:tc>
@@ -3298,7 +3835,6 @@
                 <w:bCs/>
                 <w:lang w:val="nl-NL"/>
               </w:rPr>
-              <w:lastRenderedPageBreak/>
               <w:t>5</w:t>
             </w:r>
             <w:r>
@@ -3313,13 +3849,15 @@
         </w:tc>
         <w:tc>
           <w:tcPr>
-            <w:tcW w:w="0" w:type="auto"/>
+            <w:tcW w:w="1788" w:type="dxa"/>
             <w:hideMark/>
           </w:tcPr>
           <w:p>
             <w:pPr>
               <w:spacing w:line="360" w:lineRule="auto"/>
               <w:rPr>
+                <w:b/>
+                <w:bCs/>
                 <w:lang w:val="en-US"/>
               </w:rPr>
             </w:pPr>
@@ -3331,6 +3869,14 @@
               </w:rPr>
               <w:t>Cable Entry (Telecom)</w:t>
             </w:r>
+          </w:p>
+          <w:p>
+            <w:pPr>
+              <w:spacing w:line="360" w:lineRule="auto"/>
+              <w:rPr>
+                <w:lang w:val="en-US"/>
+              </w:rPr>
+            </w:pPr>
             <w:r>
               <w:rPr>
                 <w:lang w:val="en-US"/>
@@ -3341,7 +3887,7 @@
         </w:tc>
         <w:tc>
           <w:tcPr>
-            <w:tcW w:w="0" w:type="auto"/>
+            <w:tcW w:w="5555" w:type="dxa"/>
             <w:hideMark/>
           </w:tcPr>
           <w:p>
@@ -3435,13 +3981,15 @@
         </w:tc>
         <w:tc>
           <w:tcPr>
-            <w:tcW w:w="0" w:type="auto"/>
+            <w:tcW w:w="1788" w:type="dxa"/>
             <w:hideMark/>
           </w:tcPr>
           <w:p>
             <w:pPr>
               <w:spacing w:line="360" w:lineRule="auto"/>
               <w:rPr>
+                <w:b/>
+                <w:bCs/>
                 <w:lang w:val="en-US"/>
               </w:rPr>
             </w:pPr>
@@ -3453,17 +4001,39 @@
               </w:rPr>
               <w:t>Room Shielding</w:t>
             </w:r>
+          </w:p>
+          <w:p>
+            <w:pPr>
+              <w:spacing w:line="360" w:lineRule="auto"/>
+              <w:rPr>
+                <w:lang w:val="en-US"/>
+              </w:rPr>
+            </w:pPr>
             <w:r>
               <w:rPr>
                 <w:lang w:val="en-US"/>
               </w:rPr>
-              <w:t>Ref: Bijlage 2.5</w:t>
+              <w:t xml:space="preserve">Ref: </w:t>
+            </w:r>
+            <w:proofErr w:type="spellStart"/>
+            <w:r>
+              <w:rPr>
+                <w:lang w:val="en-US"/>
+              </w:rPr>
+              <w:t>Bijlage</w:t>
+            </w:r>
+            <w:proofErr w:type="spellEnd"/>
+            <w:r>
+              <w:rPr>
+                <w:lang w:val="en-US"/>
+              </w:rPr>
+              <w:t xml:space="preserve"> 2.5</w:t>
             </w:r>
           </w:p>
         </w:tc>
         <w:tc>
           <w:tcPr>
-            <w:tcW w:w="0" w:type="auto"/>
+            <w:tcW w:w="5555" w:type="dxa"/>
             <w:hideMark/>
           </w:tcPr>
           <w:p>
@@ -3531,6 +4101,12 @@
         </w:rPr>
         <w:t>Bay Houses (Takhuisjes)</w:t>
       </w:r>
+      <w:r>
+        <w:rPr>
+          <w:lang w:val="nl-NL"/>
+        </w:rPr>
+        <w:t xml:space="preserve"> – 9:50 – 10:10</w:t>
+      </w:r>
     </w:p>
     <w:tbl>
       <w:tblPr>
@@ -3540,9 +4116,9 @@
       </w:tblPr>
       <w:tblGrid>
         <w:gridCol w:w="617"/>
-        <w:gridCol w:w="2278"/>
-        <w:gridCol w:w="5080"/>
-        <w:gridCol w:w="870"/>
+        <w:gridCol w:w="1540"/>
+        <w:gridCol w:w="5780"/>
+        <w:gridCol w:w="908"/>
         <w:gridCol w:w="727"/>
       </w:tblGrid>
       <w:tr>
@@ -3687,6 +4263,8 @@
             <w:pPr>
               <w:spacing w:line="360" w:lineRule="auto"/>
               <w:rPr>
+                <w:b/>
+                <w:bCs/>
                 <w:lang w:val="en-US"/>
               </w:rPr>
             </w:pPr>
@@ -3698,11 +4276,33 @@
               </w:rPr>
               <w:t>Building Shielding</w:t>
             </w:r>
+          </w:p>
+          <w:p>
+            <w:pPr>
+              <w:spacing w:line="360" w:lineRule="auto"/>
+              <w:rPr>
+                <w:lang w:val="en-US"/>
+              </w:rPr>
+            </w:pPr>
             <w:r>
               <w:rPr>
                 <w:lang w:val="en-US"/>
               </w:rPr>
-              <w:t>Ref: Bijlage 2.1</w:t>
+              <w:t xml:space="preserve">Ref: </w:t>
+            </w:r>
+            <w:proofErr w:type="spellStart"/>
+            <w:r>
+              <w:rPr>
+                <w:lang w:val="en-US"/>
+              </w:rPr>
+              <w:t>Bijlage</w:t>
+            </w:r>
+            <w:proofErr w:type="spellEnd"/>
+            <w:r>
+              <w:rPr>
+                <w:lang w:val="en-US"/>
+              </w:rPr>
+              <w:t xml:space="preserve"> 2.1</w:t>
             </w:r>
           </w:p>
         </w:tc>
@@ -3801,6 +4401,8 @@
             <w:pPr>
               <w:spacing w:line="360" w:lineRule="auto"/>
               <w:rPr>
+                <w:b/>
+                <w:bCs/>
                 <w:lang w:val="en-US"/>
               </w:rPr>
             </w:pPr>
@@ -3812,11 +4414,33 @@
               </w:rPr>
               <w:t>Cabinet Earthing</w:t>
             </w:r>
+          </w:p>
+          <w:p>
+            <w:pPr>
+              <w:spacing w:line="360" w:lineRule="auto"/>
+              <w:rPr>
+                <w:lang w:val="en-US"/>
+              </w:rPr>
+            </w:pPr>
             <w:r>
               <w:rPr>
                 <w:lang w:val="en-US"/>
               </w:rPr>
-              <w:t>Ref: Bijlage 1</w:t>
+              <w:t xml:space="preserve">Ref: </w:t>
+            </w:r>
+            <w:proofErr w:type="spellStart"/>
+            <w:r>
+              <w:rPr>
+                <w:lang w:val="en-US"/>
+              </w:rPr>
+              <w:t>Bijlage</w:t>
+            </w:r>
+            <w:proofErr w:type="spellEnd"/>
+            <w:r>
+              <w:rPr>
+                <w:lang w:val="en-US"/>
+              </w:rPr>
+              <w:t xml:space="preserve"> 1</w:t>
             </w:r>
           </w:p>
         </w:tc>
@@ -3889,6 +4513,12 @@
           <w:lang w:val="nl-NL"/>
         </w:rPr>
         <w:t>Field Infrastructure</w:t>
+      </w:r>
+      <w:r>
+        <w:rPr>
+          <w:lang w:val="nl-NL"/>
+        </w:rPr>
+        <w:t xml:space="preserve"> – 10:15 – 11:00</w:t>
       </w:r>
     </w:p>
     <w:tbl>
@@ -4133,6 +4763,7 @@
                 <w:bCs/>
                 <w:lang w:val="nl-NL"/>
               </w:rPr>
+              <w:lastRenderedPageBreak/>
               <w:t>5</w:t>
             </w:r>
             <w:r>
@@ -4225,6 +4856,24 @@
     </w:tbl>
     <w:p>
       <w:pPr>
+        <w:spacing w:after="200" w:line="276" w:lineRule="auto"/>
+        <w:rPr>
+          <w:b/>
+          <w:caps/>
+          <w:color w:val="0F204B"/>
+          <w:sz w:val="26"/>
+          <w:lang w:val="en-US"/>
+        </w:rPr>
+      </w:pPr>
+      <w:r>
+        <w:rPr>
+          <w:lang w:val="en-US"/>
+        </w:rPr>
+        <w:br w:type="page"/>
+      </w:r>
+    </w:p>
+    <w:p>
+      <w:pPr>
         <w:pStyle w:val="Heading1"/>
         <w:spacing w:line="360" w:lineRule="auto"/>
         <w:rPr>
@@ -4235,6 +4884,7 @@
         <w:rPr>
           <w:lang w:val="en-US"/>
         </w:rPr>
+        <w:lastRenderedPageBreak/>
         <w:t>Gap Analysis &amp; Recommendations for DP2-4</w:t>
       </w:r>
     </w:p>
@@ -4367,7 +5017,21 @@
         <w:rPr>
           <w:lang w:val="en-US"/>
         </w:rPr>
-        <w:t>To ensure EMC compliance for the new expansion despite these legacy issues, DNV recommends the following strategy for the DP2-4 design:</w:t>
+        <w:t xml:space="preserve">To ensure EMC compliance </w:t>
+      </w:r>
+      <w:proofErr w:type="gramStart"/>
+      <w:r>
+        <w:rPr>
+          <w:lang w:val="en-US"/>
+        </w:rPr>
+        <w:t>for</w:t>
+      </w:r>
+      <w:proofErr w:type="gramEnd"/>
+      <w:r>
+        <w:rPr>
+          <w:lang w:val="en-US"/>
+        </w:rPr>
+        <w:t xml:space="preserve"> the new expansion despite these legacy issues, DNV recommends the following strategy for the DP2-4 design:</w:t>
       </w:r>
     </w:p>
     <w:p>
@@ -4473,7 +5137,21 @@
         <w:rPr>
           <w:lang w:val="en-US"/>
         </w:rPr>
-        <w:t xml:space="preserve"> [PLACEHOLDER e.g., "The earth bar in Takhuisje 3 must be cleaned/tightened before connecting new DP2-4 cables."]</w:t>
+        <w:t xml:space="preserve"> [PLACEHOLDER e.g., "The earth bar in </w:t>
+      </w:r>
+      <w:proofErr w:type="spellStart"/>
+      <w:r>
+        <w:rPr>
+          <w:lang w:val="en-US"/>
+        </w:rPr>
+        <w:t>Takhuisje</w:t>
+      </w:r>
+      <w:proofErr w:type="spellEnd"/>
+      <w:r>
+        <w:rPr>
+          <w:lang w:val="en-US"/>
+        </w:rPr>
+        <w:t xml:space="preserve"> 3 must be cleaned/tightened before connecting new DP2-4 cables."]</w:t>
       </w:r>
     </w:p>
     <w:p>
@@ -5491,23 +6169,195 @@
       <w:pPr>
         <w:pStyle w:val="BodyText"/>
         <w:spacing w:line="360" w:lineRule="auto"/>
-      </w:pPr>
+        <w:sectPr>
+          <w:headerReference w:type="even" r:id="rId13"/>
+          <w:headerReference w:type="default" r:id="rId14"/>
+          <w:footerReference w:type="even" r:id="rId15"/>
+          <w:footerReference w:type="default" r:id="rId16"/>
+          <w:headerReference w:type="first" r:id="rId17"/>
+          <w:footerReference w:type="first" r:id="rId18"/>
+          <w:pgSz w:w="11907" w:h="16839"/>
+          <w:pgMar w:top="1757" w:right="1134" w:bottom="1361" w:left="1191" w:header="774" w:footer="567" w:gutter="0"/>
+          <w:cols w:space="708"/>
+          <w:titlePg/>
+          <w:docGrid w:linePitch="360"/>
+        </w:sectPr>
+      </w:pPr>
+    </w:p>
+    <w:p>
+      <w:pPr>
+        <w:pStyle w:val="BodyText"/>
+        <w:spacing w:line="360" w:lineRule="auto"/>
+      </w:pPr>
+      <w:r>
+        <w:lastRenderedPageBreak/>
+        <w:drawing>
+          <wp:inline distT="0" distB="0" distL="0" distR="0" wp14:anchorId="2B3F9B5D" wp14:editId="296C2D9D">
+            <wp:extent cx="7091916" cy="5383406"/>
+            <wp:effectExtent l="0" t="0" r="0" b="8255"/>
+            <wp:docPr id="116178897" name="Picture 1" descr="An aerial view of a power plant&#10;&#10;AI-generated content may be incorrect."/>
+            <wp:cNvGraphicFramePr>
+              <a:graphicFrameLocks xmlns:a="http://schemas.openxmlformats.org/drawingml/2006/main" noChangeAspect="1"/>
+            </wp:cNvGraphicFramePr>
+            <a:graphic xmlns:a="http://schemas.openxmlformats.org/drawingml/2006/main">
+              <a:graphicData uri="http://schemas.openxmlformats.org/drawingml/2006/picture">
+                <pic:pic xmlns:pic="http://schemas.openxmlformats.org/drawingml/2006/picture">
+                  <pic:nvPicPr>
+                    <pic:cNvPr id="116178897" name="Picture 1" descr="An aerial view of a power plant&#10;&#10;AI-generated content may be incorrect."/>
+                    <pic:cNvPicPr/>
+                  </pic:nvPicPr>
+                  <pic:blipFill>
+                    <a:blip r:embed="rId19"/>
+                    <a:stretch>
+                      <a:fillRect/>
+                    </a:stretch>
+                  </pic:blipFill>
+                  <pic:spPr>
+                    <a:xfrm>
+                      <a:off x="0" y="0"/>
+                      <a:ext cx="7096745" cy="5387071"/>
+                    </a:xfrm>
+                    <a:prstGeom prst="rect">
+                      <a:avLst/>
+                    </a:prstGeom>
+                  </pic:spPr>
+                </pic:pic>
+              </a:graphicData>
+            </a:graphic>
+          </wp:inline>
+        </w:drawing>
+      </w:r>
+      <w:r>
+        <w:lastRenderedPageBreak/>
+        <w:drawing>
+          <wp:inline distT="0" distB="0" distL="0" distR="0" wp14:anchorId="11B28111" wp14:editId="21D8340C">
+            <wp:extent cx="8653145" cy="6084570"/>
+            <wp:effectExtent l="0" t="0" r="0" b="0"/>
+            <wp:docPr id="945815720" name="Picture 1" descr="A diagram of a factory&#10;&#10;AI-generated content may be incorrect."/>
+            <wp:cNvGraphicFramePr>
+              <a:graphicFrameLocks xmlns:a="http://schemas.openxmlformats.org/drawingml/2006/main" noChangeAspect="1"/>
+            </wp:cNvGraphicFramePr>
+            <a:graphic xmlns:a="http://schemas.openxmlformats.org/drawingml/2006/main">
+              <a:graphicData uri="http://schemas.openxmlformats.org/drawingml/2006/picture">
+                <pic:pic xmlns:pic="http://schemas.openxmlformats.org/drawingml/2006/picture">
+                  <pic:nvPicPr>
+                    <pic:cNvPr id="945815720" name="Picture 1" descr="A diagram of a factory&#10;&#10;AI-generated content may be incorrect."/>
+                    <pic:cNvPicPr/>
+                  </pic:nvPicPr>
+                  <pic:blipFill>
+                    <a:blip r:embed="rId20"/>
+                    <a:stretch>
+                      <a:fillRect/>
+                    </a:stretch>
+                  </pic:blipFill>
+                  <pic:spPr>
+                    <a:xfrm>
+                      <a:off x="0" y="0"/>
+                      <a:ext cx="8653145" cy="6084570"/>
+                    </a:xfrm>
+                    <a:prstGeom prst="rect">
+                      <a:avLst/>
+                    </a:prstGeom>
+                  </pic:spPr>
+                </pic:pic>
+              </a:graphicData>
+            </a:graphic>
+          </wp:inline>
+        </w:drawing>
+      </w:r>
+    </w:p>
+    <w:p>
+      <w:pPr>
+        <w:pStyle w:val="BodyText"/>
+        <w:spacing w:line="360" w:lineRule="auto"/>
+      </w:pPr>
+      <w:r>
+        <w:lastRenderedPageBreak/>
+        <w:drawing>
+          <wp:inline distT="0" distB="0" distL="0" distR="0" wp14:anchorId="54B90DD6" wp14:editId="63301246">
+            <wp:extent cx="8712835" cy="5934710"/>
+            <wp:effectExtent l="0" t="0" r="0" b="8890"/>
+            <wp:docPr id="1414732500" name="Picture 1" descr="A diagram of a building&#10;&#10;AI-generated content may be incorrect."/>
+            <wp:cNvGraphicFramePr>
+              <a:graphicFrameLocks xmlns:a="http://schemas.openxmlformats.org/drawingml/2006/main" noChangeAspect="1"/>
+            </wp:cNvGraphicFramePr>
+            <a:graphic xmlns:a="http://schemas.openxmlformats.org/drawingml/2006/main">
+              <a:graphicData uri="http://schemas.openxmlformats.org/drawingml/2006/picture">
+                <pic:pic xmlns:pic="http://schemas.openxmlformats.org/drawingml/2006/picture">
+                  <pic:nvPicPr>
+                    <pic:cNvPr id="1414732500" name="Picture 1" descr="A diagram of a building&#10;&#10;AI-generated content may be incorrect."/>
+                    <pic:cNvPicPr/>
+                  </pic:nvPicPr>
+                  <pic:blipFill>
+                    <a:blip r:embed="rId21"/>
+                    <a:stretch>
+                      <a:fillRect/>
+                    </a:stretch>
+                  </pic:blipFill>
+                  <pic:spPr>
+                    <a:xfrm>
+                      <a:off x="0" y="0"/>
+                      <a:ext cx="8712835" cy="5934710"/>
+                    </a:xfrm>
+                    <a:prstGeom prst="rect">
+                      <a:avLst/>
+                    </a:prstGeom>
+                  </pic:spPr>
+                </pic:pic>
+              </a:graphicData>
+            </a:graphic>
+          </wp:inline>
+        </w:drawing>
+      </w:r>
     </w:p>
     <w:sectPr>
-      <w:headerReference w:type="even" r:id="rId9"/>
-      <w:headerReference w:type="default" r:id="rId10"/>
-      <w:footerReference w:type="even" r:id="rId11"/>
-      <w:footerReference w:type="default" r:id="rId12"/>
-      <w:headerReference w:type="first" r:id="rId13"/>
-      <w:footerReference w:type="first" r:id="rId14"/>
-      <w:pgSz w:w="11907" w:h="16839"/>
-      <w:pgMar w:top="1757" w:right="1134" w:bottom="1361" w:left="1191" w:header="774" w:footer="567" w:gutter="0"/>
+      <w:pgSz w:w="16839" w:h="11907" w:orient="landscape"/>
+      <w:pgMar w:top="1191" w:right="1757" w:bottom="1134" w:left="1361" w:header="774" w:footer="567" w:gutter="0"/>
       <w:cols w:space="708"/>
       <w:titlePg/>
       <w:docGrid w:linePitch="360"/>
     </w:sectPr>
   </w:body>
 </w:document>
+</file>
+
+<file path=word/comments.xml><?xml version="1.0" encoding="utf-8"?>
+<w:comments xmlns:wpc="http://schemas.microsoft.com/office/word/2010/wordprocessingCanvas" xmlns:cx="http://schemas.microsoft.com/office/drawing/2014/chartex" xmlns:cx1="http://schemas.microsoft.com/office/drawing/2015/9/8/chartex" xmlns:cx2="http://schemas.microsoft.com/office/drawing/2015/10/21/chartex" xmlns:cx3="http://schemas.microsoft.com/office/drawing/2016/5/9/chartex" xmlns:cx4="http://schemas.microsoft.com/office/drawing/2016/5/10/chartex" xmlns:cx5="http://schemas.microsoft.com/office/drawing/2016/5/11/chartex" xmlns:cx6="http://schemas.microsoft.com/office/drawing/2016/5/12/chartex" xmlns:cx7="http://schemas.microsoft.com/office/drawing/2016/5/13/chartex" xmlns:cx8="http://schemas.microsoft.com/office/drawing/2016/5/14/chartex" xmlns:mc="http://schemas.openxmlformats.org/markup-compatibility/2006" xmlns:aink="http://schemas.microsoft.com/office/drawing/2016/ink" xmlns:am3d="http://schemas.microsoft.com/office/drawing/2017/model3d" xmlns:o="urn:schemas-microsoft-com:office:office" xmlns:oel="http://schemas.microsoft.com/office/2019/extlst" xmlns:r="http://schemas.openxmlformats.org/officeDocument/2006/relationships" xmlns:m="http://schemas.openxmlformats.org/officeDocument/2006/math" xmlns:v="urn:schemas-microsoft-com:vml" xmlns:wp14="http://schemas.microsoft.com/office/word/2010/wordprocessingDrawing" xmlns:wp="http://schemas.openxmlformats.org/drawingml/2006/wordprocessingDrawing" xmlns:w10="urn:schemas-microsoft-com:office:word" xmlns:w="http://schemas.openxmlformats.org/wordprocessingml/2006/main" xmlns:w14="http://schemas.microsoft.com/office/word/2010/wordml" xmlns:w15="http://schemas.microsoft.com/office/word/2012/wordml" xmlns:w16cex="http://schemas.microsoft.com/office/word/2018/wordml/cex" xmlns:w16cid="http://schemas.microsoft.com/office/word/2016/wordml/cid" xmlns:w16="http://schemas.microsoft.com/office/word/2018/wordml" xmlns:w16du="http://schemas.microsoft.com/office/word/2023/wordml/word16du" xmlns:w16sdtdh="http://schemas.microsoft.com/office/word/2020/wordml/sdtdatahash" xmlns:w16sdtfl="http://schemas.microsoft.com/office/word/2024/wordml/sdtformatlock" xmlns:w16se="http://schemas.microsoft.com/office/word/2015/wordml/symex" xmlns:wpg="http://schemas.microsoft.com/office/word/2010/wordprocessingGroup" xmlns:wpi="http://schemas.microsoft.com/office/word/2010/wordprocessingInk" xmlns:wne="http://schemas.microsoft.com/office/word/2006/wordml" xmlns:wps="http://schemas.microsoft.com/office/word/2010/wordprocessingShape" mc:Ignorable="w14 w15 w16se w16cid w16 w16cex w16sdtdh w16sdtfl w16du wp14">
+  <w:comment w:id="0" w:author="Schutte, Peet" w:date="2025-12-04T13:15:00Z" w:initials="PS">
+    <w:p>
+      <w:pPr>
+        <w:pStyle w:val="CommentText"/>
+      </w:pPr>
+      <w:r>
+        <w:rPr>
+          <w:rStyle w:val="CommentReference"/>
+        </w:rPr>
+        <w:annotationRef/>
+      </w:r>
+      <w:r>
+        <w:t>Add column to incorporate timing</w:t>
+      </w:r>
+    </w:p>
+  </w:comment>
+</w:comments>
+</file>
+
+<file path=word/commentsExtended.xml><?xml version="1.0" encoding="utf-8"?>
+<w15:commentsEx xmlns:wpc="http://schemas.microsoft.com/office/word/2010/wordprocessingCanvas" xmlns:cx="http://schemas.microsoft.com/office/drawing/2014/chartex" xmlns:cx1="http://schemas.microsoft.com/office/drawing/2015/9/8/chartex" xmlns:cx2="http://schemas.microsoft.com/office/drawing/2015/10/21/chartex" xmlns:cx3="http://schemas.microsoft.com/office/drawing/2016/5/9/chartex" xmlns:cx4="http://schemas.microsoft.com/office/drawing/2016/5/10/chartex" xmlns:cx5="http://schemas.microsoft.com/office/drawing/2016/5/11/chartex" xmlns:cx6="http://schemas.microsoft.com/office/drawing/2016/5/12/chartex" xmlns:cx7="http://schemas.microsoft.com/office/drawing/2016/5/13/chartex" xmlns:cx8="http://schemas.microsoft.com/office/drawing/2016/5/14/chartex" xmlns:mc="http://schemas.openxmlformats.org/markup-compatibility/2006" xmlns:aink="http://schemas.microsoft.com/office/drawing/2016/ink" xmlns:am3d="http://schemas.microsoft.com/office/drawing/2017/model3d" xmlns:o="urn:schemas-microsoft-com:office:office" xmlns:oel="http://schemas.microsoft.com/office/2019/extlst" xmlns:r="http://schemas.openxmlformats.org/officeDocument/2006/relationships" xmlns:m="http://schemas.openxmlformats.org/officeDocument/2006/math" xmlns:v="urn:schemas-microsoft-com:vml" xmlns:wp14="http://schemas.microsoft.com/office/word/2010/wordprocessingDrawing" xmlns:wp="http://schemas.openxmlformats.org/drawingml/2006/wordprocessingDrawing" xmlns:w10="urn:schemas-microsoft-com:office:word" xmlns:w="http://schemas.openxmlformats.org/wordprocessingml/2006/main" xmlns:w14="http://schemas.microsoft.com/office/word/2010/wordml" xmlns:w15="http://schemas.microsoft.com/office/word/2012/wordml" xmlns:w16cex="http://schemas.microsoft.com/office/word/2018/wordml/cex" xmlns:w16cid="http://schemas.microsoft.com/office/word/2016/wordml/cid" xmlns:w16="http://schemas.microsoft.com/office/word/2018/wordml" xmlns:w16du="http://schemas.microsoft.com/office/word/2023/wordml/word16du" xmlns:w16sdtdh="http://schemas.microsoft.com/office/word/2020/wordml/sdtdatahash" xmlns:w16sdtfl="http://schemas.microsoft.com/office/word/2024/wordml/sdtformatlock" xmlns:w16se="http://schemas.microsoft.com/office/word/2015/wordml/symex" xmlns:wpg="http://schemas.microsoft.com/office/word/2010/wordprocessingGroup" xmlns:wpi="http://schemas.microsoft.com/office/word/2010/wordprocessingInk" xmlns:wne="http://schemas.microsoft.com/office/word/2006/wordml" xmlns:wps="http://schemas.microsoft.com/office/word/2010/wordprocessingShape" mc:Ignorable="w14 w15 w16se w16cid w16 w16cex w16sdtdh w16sdtfl w16du wp14">
+  <w15:commentEx w15:paraId="5034DBB5" w15:done="1"/>
+</w15:commentsEx>
+</file>
+
+<file path=word/commentsExtensible.xml><?xml version="1.0" encoding="utf-8"?>
+<w16cex:commentsExtensible xmlns:wpc="http://schemas.microsoft.com/office/word/2010/wordprocessingCanvas" xmlns:cx="http://schemas.microsoft.com/office/drawing/2014/chartex" xmlns:cx1="http://schemas.microsoft.com/office/drawing/2015/9/8/chartex" xmlns:cx2="http://schemas.microsoft.com/office/drawing/2015/10/21/chartex" xmlns:cx3="http://schemas.microsoft.com/office/drawing/2016/5/9/chartex" xmlns:cx4="http://schemas.microsoft.com/office/drawing/2016/5/10/chartex" xmlns:cx5="http://schemas.microsoft.com/office/drawing/2016/5/11/chartex" xmlns:cx6="http://schemas.microsoft.com/office/drawing/2016/5/12/chartex" xmlns:cx7="http://schemas.microsoft.com/office/drawing/2016/5/13/chartex" xmlns:cx8="http://schemas.microsoft.com/office/drawing/2016/5/14/chartex" xmlns:cr="http://schemas.microsoft.com/office/comments/2020/reactions" xmlns:mc="http://schemas.openxmlformats.org/markup-compatibility/2006" xmlns:aink="http://schemas.microsoft.com/office/drawing/2016/ink" xmlns:am3d="http://schemas.microsoft.com/office/drawing/2017/model3d" xmlns:o="urn:schemas-microsoft-com:office:office" xmlns:oel="http://schemas.microsoft.com/office/2019/extlst" xmlns:r="http://schemas.openxmlformats.org/officeDocument/2006/relationships" xmlns:m="http://schemas.openxmlformats.org/officeDocument/2006/math" xmlns:v="urn:schemas-microsoft-com:vml" xmlns:wp14="http://schemas.microsoft.com/office/word/2010/wordprocessingDrawing" xmlns:wp="http://schemas.openxmlformats.org/drawingml/2006/wordprocessingDrawing" xmlns:w10="urn:schemas-microsoft-com:office:word" xmlns:w="http://schemas.openxmlformats.org/wordprocessingml/2006/main" xmlns:w14="http://schemas.microsoft.com/office/word/2010/wordml" xmlns:w15="http://schemas.microsoft.com/office/word/2012/wordml" xmlns:w16cex="http://schemas.microsoft.com/office/word/2018/wordml/cex" xmlns:w16cid="http://schemas.microsoft.com/office/word/2016/wordml/cid" xmlns:w16="http://schemas.microsoft.com/office/word/2018/wordml" xmlns:w16du="http://schemas.microsoft.com/office/word/2023/wordml/word16du" xmlns:w16sdtdh="http://schemas.microsoft.com/office/word/2020/wordml/sdtdatahash" xmlns:w16sdtfl="http://schemas.microsoft.com/office/word/2024/wordml/sdtformatlock" xmlns:w16se="http://schemas.microsoft.com/office/word/2015/wordml/symex" xmlns:wpg="http://schemas.microsoft.com/office/word/2010/wordprocessingGroup" xmlns:wpi="http://schemas.microsoft.com/office/word/2010/wordprocessingInk" xmlns:wne="http://schemas.microsoft.com/office/word/2006/wordml" xmlns:wps="http://schemas.microsoft.com/office/word/2010/wordprocessingShape" mc:Ignorable="w14 w15 w16se w16cid w16 w16cex w16sdtdh w16sdtfl cr w16du wp14">
+  <w16cex:commentExtensible w16cex:durableId="6B22A55E" w16cex:dateUtc="2025-12-04T12:15:00Z"/>
+</w16cex:commentsExtensible>
+</file>
+
+<file path=word/commentsIds.xml><?xml version="1.0" encoding="utf-8"?>
+<w16cid:commentsIds xmlns:wpc="http://schemas.microsoft.com/office/word/2010/wordprocessingCanvas" xmlns:cx="http://schemas.microsoft.com/office/drawing/2014/chartex" xmlns:cx1="http://schemas.microsoft.com/office/drawing/2015/9/8/chartex" xmlns:cx2="http://schemas.microsoft.com/office/drawing/2015/10/21/chartex" xmlns:cx3="http://schemas.microsoft.com/office/drawing/2016/5/9/chartex" xmlns:cx4="http://schemas.microsoft.com/office/drawing/2016/5/10/chartex" xmlns:cx5="http://schemas.microsoft.com/office/drawing/2016/5/11/chartex" xmlns:cx6="http://schemas.microsoft.com/office/drawing/2016/5/12/chartex" xmlns:cx7="http://schemas.microsoft.com/office/drawing/2016/5/13/chartex" xmlns:cx8="http://schemas.microsoft.com/office/drawing/2016/5/14/chartex" xmlns:mc="http://schemas.openxmlformats.org/markup-compatibility/2006" xmlns:aink="http://schemas.microsoft.com/office/drawing/2016/ink" xmlns:am3d="http://schemas.microsoft.com/office/drawing/2017/model3d" xmlns:o="urn:schemas-microsoft-com:office:office" xmlns:oel="http://schemas.microsoft.com/office/2019/extlst" xmlns:r="http://schemas.openxmlformats.org/officeDocument/2006/relationships" xmlns:m="http://schemas.openxmlformats.org/officeDocument/2006/math" xmlns:v="urn:schemas-microsoft-com:vml" xmlns:wp14="http://schemas.microsoft.com/office/word/2010/wordprocessingDrawing" xmlns:wp="http://schemas.openxmlformats.org/drawingml/2006/wordprocessingDrawing" xmlns:w10="urn:schemas-microsoft-com:office:word" xmlns:w="http://schemas.openxmlformats.org/wordprocessingml/2006/main" xmlns:w14="http://schemas.microsoft.com/office/word/2010/wordml" xmlns:w15="http://schemas.microsoft.com/office/word/2012/wordml" xmlns:w16cex="http://schemas.microsoft.com/office/word/2018/wordml/cex" xmlns:w16cid="http://schemas.microsoft.com/office/word/2016/wordml/cid" xmlns:w16="http://schemas.microsoft.com/office/word/2018/wordml" xmlns:w16du="http://schemas.microsoft.com/office/word/2023/wordml/word16du" xmlns:w16sdtdh="http://schemas.microsoft.com/office/word/2020/wordml/sdtdatahash" xmlns:w16sdtfl="http://schemas.microsoft.com/office/word/2024/wordml/sdtformatlock" xmlns:w16se="http://schemas.microsoft.com/office/word/2015/wordml/symex" xmlns:wpg="http://schemas.microsoft.com/office/word/2010/wordprocessingGroup" xmlns:wpi="http://schemas.microsoft.com/office/word/2010/wordprocessingInk" xmlns:wne="http://schemas.microsoft.com/office/word/2006/wordml" xmlns:wps="http://schemas.microsoft.com/office/word/2010/wordprocessingShape" mc:Ignorable="w14 w15 w16se w16cid w16 w16cex w16sdtdh w16sdtfl w16du wp14">
+  <w16cid:commentId w16cid:paraId="5034DBB5" w16cid:durableId="6B22A55E"/>
+</w16cid:commentsIds>
 </file>
 
 <file path=word/customizations.xml><?xml version="1.0" encoding="utf-8"?>
@@ -5675,7 +6525,7 @@
             <w:fldChar w:fldCharType="separate"/>
           </w:r>
           <w:r>
-            <w:t>Site Audit proposal for report</w:t>
+            <w:t>Site Audit proposal for report V1</w:t>
           </w:r>
           <w:r>
             <w:fldChar w:fldCharType="end"/>
@@ -5788,7 +6638,7 @@
             <w:fldChar w:fldCharType="separate"/>
           </w:r>
           <w:r>
-            <w:t>Site Audit proposal for report</w:t>
+            <w:t>Site Audit proposal for report V1</w:t>
           </w:r>
           <w:r>
             <w:fldChar w:fldCharType="end"/>
@@ -9337,6 +10187,14 @@
     <w:abstractNumId w:val="18"/>
   </w:num>
 </w:numbering>
+</file>
+
+<file path=word/people.xml><?xml version="1.0" encoding="utf-8"?>
+<w15:people xmlns:wpc="http://schemas.microsoft.com/office/word/2010/wordprocessingCanvas" xmlns:cx="http://schemas.microsoft.com/office/drawing/2014/chartex" xmlns:cx1="http://schemas.microsoft.com/office/drawing/2015/9/8/chartex" xmlns:cx2="http://schemas.microsoft.com/office/drawing/2015/10/21/chartex" xmlns:cx3="http://schemas.microsoft.com/office/drawing/2016/5/9/chartex" xmlns:cx4="http://schemas.microsoft.com/office/drawing/2016/5/10/chartex" xmlns:cx5="http://schemas.microsoft.com/office/drawing/2016/5/11/chartex" xmlns:cx6="http://schemas.microsoft.com/office/drawing/2016/5/12/chartex" xmlns:cx7="http://schemas.microsoft.com/office/drawing/2016/5/13/chartex" xmlns:cx8="http://schemas.microsoft.com/office/drawing/2016/5/14/chartex" xmlns:mc="http://schemas.openxmlformats.org/markup-compatibility/2006" xmlns:aink="http://schemas.microsoft.com/office/drawing/2016/ink" xmlns:am3d="http://schemas.microsoft.com/office/drawing/2017/model3d" xmlns:o="urn:schemas-microsoft-com:office:office" xmlns:oel="http://schemas.microsoft.com/office/2019/extlst" xmlns:r="http://schemas.openxmlformats.org/officeDocument/2006/relationships" xmlns:m="http://schemas.openxmlformats.org/officeDocument/2006/math" xmlns:v="urn:schemas-microsoft-com:vml" xmlns:wp14="http://schemas.microsoft.com/office/word/2010/wordprocessingDrawing" xmlns:wp="http://schemas.openxmlformats.org/drawingml/2006/wordprocessingDrawing" xmlns:w10="urn:schemas-microsoft-com:office:word" xmlns:w="http://schemas.openxmlformats.org/wordprocessingml/2006/main" xmlns:w14="http://schemas.microsoft.com/office/word/2010/wordml" xmlns:w15="http://schemas.microsoft.com/office/word/2012/wordml" xmlns:w16cex="http://schemas.microsoft.com/office/word/2018/wordml/cex" xmlns:w16cid="http://schemas.microsoft.com/office/word/2016/wordml/cid" xmlns:w16="http://schemas.microsoft.com/office/word/2018/wordml" xmlns:w16du="http://schemas.microsoft.com/office/word/2023/wordml/word16du" xmlns:w16sdtdh="http://schemas.microsoft.com/office/word/2020/wordml/sdtdatahash" xmlns:w16sdtfl="http://schemas.microsoft.com/office/word/2024/wordml/sdtformatlock" xmlns:w16se="http://schemas.microsoft.com/office/word/2015/wordml/symex" xmlns:wpg="http://schemas.microsoft.com/office/word/2010/wordprocessingGroup" xmlns:wpi="http://schemas.microsoft.com/office/word/2010/wordprocessingInk" xmlns:wne="http://schemas.microsoft.com/office/word/2006/wordml" xmlns:wps="http://schemas.microsoft.com/office/word/2010/wordprocessingShape" mc:Ignorable="w14 w15 w16se w16cid w16 w16cex w16sdtdh w16sdtfl w16du wp14">
+  <w15:person w15:author="Schutte, Peet">
+    <w15:presenceInfo w15:providerId="AD" w15:userId="S::Peet.Schutte@dnv.com::b9242d6b-b4c4-408c-9191-11fb4494effa"/>
+  </w15:person>
+</w15:people>
 </file>
 
 <file path=word/styles.xml><?xml version="1.0" encoding="utf-8"?>
@@ -9805,6 +10663,7 @@
   <w:style w:type="character" w:default="1" w:styleId="DefaultParagraphFont">
     <w:name w:val="Default Paragraph Font"/>
     <w:uiPriority w:val="1"/>
+    <w:semiHidden/>
     <w:unhideWhenUsed/>
   </w:style>
   <w:style w:type="table" w:default="1" w:styleId="TableNormal">
@@ -11371,7 +12230,6 @@
     <w:basedOn w:val="Normal"/>
     <w:link w:val="CommentTextChar"/>
     <w:uiPriority w:val="99"/>
-    <w:semiHidden/>
     <w:unhideWhenUsed/>
     <w:rsid w:val="00866BDC"/>
     <w:rPr>
@@ -11384,7 +12242,6 @@
     <w:basedOn w:val="DefaultParagraphFont"/>
     <w:link w:val="CommentText"/>
     <w:uiPriority w:val="99"/>
-    <w:semiHidden/>
     <w:rsid w:val="00866BDC"/>
     <w:rPr>
       <w:rFonts w:ascii="Arial" w:hAnsi="Arial" w:cs="Arial"/>

</xml_diff>